<commit_message>
fix: Standardize Participation and Appreciation to A4 landscape, Appearance CA to A5 landscape, and polish UI
</commit_message>
<xml_diff>
--- a/CA MOVE TEMPLATE.docx
+++ b/CA MOVE TEMPLATE.docx
@@ -4,20 +4,13 @@
   <w:body>
     <w:p>
       <w:pPr>
-        <w:rPr>
-          <w:lang w:val="en-US"/>
-        </w:rPr>
-      </w:pPr>
-    </w:p>
-    <w:p>
-      <w:pPr>
         <w:jc w:val="center"/>
         <w:rPr>
           <w:rFonts w:ascii="MS Reference Sans Serif" w:hAnsi="MS Reference Sans Serif"/>
           <w:b/>
           <w:bCs/>
-          <w:sz w:val="40"/>
-          <w:szCs w:val="40"/>
+          <w:sz w:val="36"/>
+          <w:szCs w:val="36"/>
           <w:lang w:val="en-US"/>
         </w:rPr>
       </w:pPr>
@@ -26,8 +19,8 @@
           <w:rFonts w:ascii="MS Reference Sans Serif" w:hAnsi="MS Reference Sans Serif"/>
           <w:b/>
           <w:bCs/>
-          <w:sz w:val="40"/>
-          <w:szCs w:val="40"/>
+          <w:sz w:val="36"/>
+          <w:szCs w:val="36"/>
           <w:lang w:val="en-US"/>
         </w:rPr>
         <w:t>CERTIFICAT</w:t>
@@ -37,8 +30,8 @@
           <w:rFonts w:ascii="MS Reference Sans Serif" w:hAnsi="MS Reference Sans Serif"/>
           <w:b/>
           <w:bCs/>
-          <w:sz w:val="40"/>
-          <w:szCs w:val="40"/>
+          <w:sz w:val="36"/>
+          <w:szCs w:val="36"/>
           <w:lang w:val="en-US"/>
         </w:rPr>
         <w:t>E OF APPEARANCE</w:t>
@@ -46,7 +39,16 @@
     </w:p>
     <w:p>
       <w:pPr>
-        <w:jc w:val="center"/>
+        <w:rPr>
+          <w:rFonts w:ascii="Arial" w:hAnsi="Arial" w:cs="Arial"/>
+          <w:sz w:val="10"/>
+          <w:szCs w:val="10"/>
+          <w:lang w:val="en-US"/>
+        </w:rPr>
+      </w:pPr>
+    </w:p>
+    <w:p>
+      <w:pPr>
         <w:rPr>
           <w:rFonts w:ascii="Arial" w:hAnsi="Arial" w:cs="Arial"/>
           <w:sz w:val="24"/>
@@ -61,16 +63,7 @@
           <w:szCs w:val="24"/>
           <w:lang w:val="en-US"/>
         </w:rPr>
-        <w:t>This</w:t>
-      </w:r>
-      <w:r>
-        <w:rPr>
-          <w:rFonts w:ascii="Arial" w:hAnsi="Arial" w:cs="Arial"/>
-          <w:sz w:val="24"/>
-          <w:szCs w:val="24"/>
-          <w:lang w:val="en-US"/>
-        </w:rPr>
-        <w:t xml:space="preserve"> is to certify that the following employees appeared as </w:t>
+        <w:t xml:space="preserve">This is to certify that </w:t>
       </w:r>
       <w:r>
         <w:rPr>
@@ -81,18 +74,7 @@
           <w:szCs w:val="24"/>
           <w:lang w:val="en-US"/>
         </w:rPr>
-        <w:t>Participant/Facilitator</w:t>
-      </w:r>
-      <w:r>
-        <w:rPr>
-          <w:rFonts w:ascii="Arial" w:hAnsi="Arial" w:cs="Arial"/>
-          <w:b/>
-          <w:bCs/>
-          <w:sz w:val="24"/>
-          <w:szCs w:val="24"/>
-          <w:lang w:val="en-US"/>
-        </w:rPr>
-        <w:t xml:space="preserve"> </w:t>
+        <w:t>MR. MICHAEL M. DIAZEN</w:t>
       </w:r>
       <w:r>
         <w:rPr>
@@ -101,209 +83,66 @@
           <w:szCs w:val="24"/>
           <w:lang w:val="en-US"/>
         </w:rPr>
-        <w:t>during the</w:t>
-      </w:r>
-      <w:r>
-        <w:rPr>
-          <w:rFonts w:ascii="Arial" w:hAnsi="Arial" w:cs="Arial"/>
-          <w:sz w:val="24"/>
-          <w:szCs w:val="24"/>
-          <w:lang w:val="en-US"/>
-        </w:rPr>
-        <w:t xml:space="preserve"> </w:t>
-      </w:r>
-      <w:r>
-        <w:rPr>
-          <w:rFonts w:ascii="Arial" w:hAnsi="Arial" w:cs="Arial"/>
-          <w:sz w:val="24"/>
-          <w:szCs w:val="24"/>
-          <w:lang w:val="en-US"/>
-        </w:rPr>
-        <w:t>“</w:t>
-      </w:r>
-      <w:r>
-        <w:rPr>
-          <w:rFonts w:ascii="Arial" w:hAnsi="Arial" w:cs="Arial"/>
-          <w:b/>
-          <w:bCs/>
-          <w:sz w:val="24"/>
-          <w:szCs w:val="24"/>
-          <w:lang w:val="en-US"/>
-        </w:rPr>
-        <w:t>MEN IN THE KITCHEN</w:t>
-      </w:r>
-      <w:r>
-        <w:rPr>
-          <w:rFonts w:ascii="Arial" w:hAnsi="Arial" w:cs="Arial"/>
-          <w:b/>
-          <w:bCs/>
-          <w:sz w:val="24"/>
-          <w:szCs w:val="24"/>
-          <w:lang w:val="en-US"/>
-        </w:rPr>
-        <w:t xml:space="preserve"> 2</w:t>
-      </w:r>
-      <w:r>
-        <w:rPr>
-          <w:rFonts w:ascii="Arial" w:hAnsi="Arial" w:cs="Arial"/>
-          <w:b/>
-          <w:bCs/>
-          <w:sz w:val="24"/>
-          <w:szCs w:val="24"/>
-          <w:lang w:val="en-US"/>
-        </w:rPr>
-        <w:t>”</w:t>
-      </w:r>
-      <w:r>
-        <w:rPr>
-          <w:rFonts w:ascii="Arial" w:hAnsi="Arial" w:cs="Arial"/>
-          <w:sz w:val="24"/>
-          <w:szCs w:val="24"/>
-          <w:lang w:val="en-US"/>
-        </w:rPr>
-        <w:t xml:space="preserve"> </w:t>
-      </w:r>
-      <w:r>
-        <w:rPr>
-          <w:rFonts w:ascii="Arial" w:hAnsi="Arial" w:cs="Arial"/>
-          <w:sz w:val="24"/>
-          <w:szCs w:val="24"/>
-          <w:lang w:val="en-US"/>
-        </w:rPr>
-        <w:t xml:space="preserve">(title) </w:t>
-      </w:r>
-      <w:r>
-        <w:rPr>
-          <w:rFonts w:ascii="Arial" w:hAnsi="Arial" w:cs="Arial"/>
-          <w:sz w:val="24"/>
-          <w:szCs w:val="24"/>
-          <w:lang w:val="en-US"/>
-        </w:rPr>
-        <w:t>with the theme “</w:t>
-      </w:r>
-      <w:r>
-        <w:rPr>
-          <w:rFonts w:ascii="Arial" w:hAnsi="Arial" w:cs="Arial"/>
-          <w:i/>
-          <w:iCs/>
-          <w:sz w:val="24"/>
-          <w:szCs w:val="24"/>
-          <w:lang w:val="en-US"/>
-        </w:rPr>
-        <w:t xml:space="preserve">Love Served in the </w:t>
-      </w:r>
-      <w:proofErr w:type="gramStart"/>
-      <w:r>
-        <w:rPr>
-          <w:rFonts w:ascii="Arial" w:hAnsi="Arial" w:cs="Arial"/>
-          <w:i/>
-          <w:iCs/>
-          <w:sz w:val="24"/>
-          <w:szCs w:val="24"/>
-          <w:lang w:val="en-US"/>
-        </w:rPr>
-        <w:t>Kitchen</w:t>
-      </w:r>
-      <w:r>
-        <w:rPr>
-          <w:rFonts w:ascii="Arial" w:hAnsi="Arial" w:cs="Arial"/>
-          <w:i/>
-          <w:iCs/>
-          <w:sz w:val="24"/>
-          <w:szCs w:val="24"/>
-          <w:lang w:val="en-US"/>
-        </w:rPr>
-        <w:t>”</w:t>
-      </w:r>
-      <w:r>
-        <w:rPr>
-          <w:rFonts w:ascii="Arial" w:hAnsi="Arial" w:cs="Arial"/>
-          <w:i/>
-          <w:iCs/>
-          <w:sz w:val="24"/>
-          <w:szCs w:val="24"/>
-          <w:lang w:val="en-US"/>
-        </w:rPr>
-        <w:t>(</w:t>
-      </w:r>
-      <w:proofErr w:type="gramEnd"/>
-      <w:r>
-        <w:rPr>
-          <w:rFonts w:ascii="Arial" w:hAnsi="Arial" w:cs="Arial"/>
-          <w:i/>
-          <w:iCs/>
-          <w:sz w:val="24"/>
-          <w:szCs w:val="24"/>
-          <w:lang w:val="en-US"/>
-        </w:rPr>
-        <w:t xml:space="preserve">short </w:t>
-      </w:r>
-      <w:proofErr w:type="spellStart"/>
-      <w:r>
-        <w:rPr>
-          <w:rFonts w:ascii="Arial" w:hAnsi="Arial" w:cs="Arial"/>
-          <w:i/>
-          <w:iCs/>
-          <w:sz w:val="24"/>
-          <w:szCs w:val="24"/>
-          <w:lang w:val="en-US"/>
-        </w:rPr>
-        <w:t>discription</w:t>
-      </w:r>
-      <w:proofErr w:type="spellEnd"/>
-      <w:r>
-        <w:rPr>
-          <w:rFonts w:ascii="Arial" w:hAnsi="Arial" w:cs="Arial"/>
-          <w:i/>
-          <w:iCs/>
-          <w:sz w:val="24"/>
-          <w:szCs w:val="24"/>
-          <w:lang w:val="en-US"/>
-        </w:rPr>
-        <w:t>)</w:t>
-      </w:r>
-      <w:r>
-        <w:rPr>
-          <w:rFonts w:ascii="Arial" w:hAnsi="Arial" w:cs="Arial"/>
-          <w:i/>
-          <w:iCs/>
-          <w:sz w:val="24"/>
-          <w:szCs w:val="24"/>
-          <w:lang w:val="en-US"/>
-        </w:rPr>
-        <w:t xml:space="preserve"> </w:t>
-      </w:r>
-      <w:r>
-        <w:rPr>
-          <w:rFonts w:ascii="Arial" w:hAnsi="Arial" w:cs="Arial"/>
-          <w:sz w:val="24"/>
-          <w:szCs w:val="24"/>
-          <w:lang w:val="en-US"/>
-        </w:rPr>
-        <w:t xml:space="preserve">on December 9, 2025 </w:t>
-      </w:r>
-      <w:r>
-        <w:rPr>
-          <w:rFonts w:ascii="Arial" w:hAnsi="Arial" w:cs="Arial"/>
-          <w:sz w:val="24"/>
-          <w:szCs w:val="24"/>
-          <w:lang w:val="en-US"/>
-        </w:rPr>
-        <w:t>at the CDRRMO Building, CEO Compound, Lower Rock Quarry, Baguio City</w:t>
-      </w:r>
-      <w:r>
-        <w:rPr>
-          <w:rFonts w:ascii="Arial" w:hAnsi="Arial" w:cs="Arial"/>
-          <w:sz w:val="24"/>
-          <w:szCs w:val="24"/>
-          <w:lang w:val="en-US"/>
-        </w:rPr>
-        <w:t>. (Location)</w:t>
+        <w:t>, Engineer II (Sanitary Engineer) of CEPMO, attended the activity “Men in the Kitchen 2: Love Served in the Kitchen” on October 20, 2026, at the CDRRMO Building, Lower Rock Quarry, Baguio City.</w:t>
       </w:r>
     </w:p>
     <w:p>
       <w:pPr>
-        <w:jc w:val="center"/>
+        <w:rPr>
+          <w:rFonts w:ascii="Arial" w:hAnsi="Arial" w:cs="Arial"/>
+          <w:sz w:val="24"/>
+          <w:szCs w:val="24"/>
+          <w:lang w:val="en-US"/>
+        </w:rPr>
+      </w:pPr>
+      <w:r>
+        <w:rPr>
+          <w:rFonts w:ascii="Arial" w:hAnsi="Arial" w:cs="Arial"/>
+          <w:sz w:val="24"/>
+          <w:szCs w:val="24"/>
+          <w:lang w:val="en-US"/>
+        </w:rPr>
+        <w:t>This certification is issued to ju</w:t>
+      </w:r>
+      <w:r>
+        <w:rPr>
+          <w:rFonts w:ascii="Arial" w:hAnsi="Arial" w:cs="Arial"/>
+          <w:sz w:val="24"/>
+          <w:szCs w:val="24"/>
+          <w:lang w:val="en-US"/>
+        </w:rPr>
+        <w:t>stify</w:t>
+      </w:r>
+      <w:r>
+        <w:rPr>
+          <w:rFonts w:ascii="Arial" w:hAnsi="Arial" w:cs="Arial"/>
+          <w:sz w:val="24"/>
+          <w:szCs w:val="24"/>
+          <w:lang w:val="en-US"/>
+        </w:rPr>
+        <w:t xml:space="preserve"> the non-entry of </w:t>
+      </w:r>
+      <w:r>
+        <w:rPr>
+          <w:rFonts w:ascii="Arial" w:hAnsi="Arial" w:cs="Arial"/>
+          <w:sz w:val="24"/>
+          <w:szCs w:val="24"/>
+          <w:lang w:val="en-US"/>
+        </w:rPr>
+        <w:t>data</w:t>
+      </w:r>
+      <w:r>
+        <w:rPr>
+          <w:rFonts w:ascii="Arial" w:hAnsi="Arial" w:cs="Arial"/>
+          <w:sz w:val="24"/>
+          <w:szCs w:val="24"/>
+          <w:lang w:val="en-US"/>
+        </w:rPr>
+        <w:t xml:space="preserve"> in his Daily Time Record (DTR) on the aforementioned date.</w:t>
+      </w:r>
+    </w:p>
+    <w:p>
+      <w:pPr>
         <w:rPr>
           <w:rFonts w:ascii="Arial" w:hAnsi="Arial" w:cs="Arial"/>
           <w:sz w:val="24"/>
@@ -314,133 +153,55 @@
     </w:p>
     <w:p>
       <w:pPr>
-        <w:jc w:val="center"/>
         <w:rPr>
           <w:rFonts w:ascii="Arial" w:hAnsi="Arial" w:cs="Arial"/>
+          <w:sz w:val="24"/>
+          <w:szCs w:val="24"/>
           <w:lang w:val="en-US"/>
         </w:rPr>
       </w:pPr>
       <w:r>
         <w:rPr>
           <w:rFonts w:ascii="Arial" w:hAnsi="Arial" w:cs="Arial"/>
-          <w:lang w:val="en-US"/>
-        </w:rPr>
-        <w:t>This certification is issued to support the non-</w:t>
-      </w:r>
-      <w:r>
-        <w:rPr>
-          <w:rFonts w:ascii="Arial" w:hAnsi="Arial" w:cs="Arial"/>
-          <w:lang w:val="en-US"/>
-        </w:rPr>
-        <w:t>entry of</w:t>
-      </w:r>
-      <w:r>
-        <w:rPr>
-          <w:rFonts w:ascii="Arial" w:hAnsi="Arial" w:cs="Arial"/>
-          <w:lang w:val="en-US"/>
-        </w:rPr>
-        <w:t xml:space="preserve"> on the</w:t>
-      </w:r>
-      <w:r>
-        <w:rPr>
-          <w:rFonts w:ascii="Arial" w:hAnsi="Arial" w:cs="Arial"/>
-          <w:lang w:val="en-US"/>
-        </w:rPr>
-        <w:t xml:space="preserve"> daily time records</w:t>
-      </w:r>
-      <w:r>
-        <w:rPr>
-          <w:rFonts w:ascii="Arial" w:hAnsi="Arial" w:cs="Arial"/>
-          <w:lang w:val="en-US"/>
-        </w:rPr>
-        <w:t xml:space="preserve"> above date.</w:t>
+          <w:sz w:val="24"/>
+          <w:szCs w:val="24"/>
+          <w:lang w:val="en-US"/>
+        </w:rPr>
+        <w:t>Issued this 9th day of December 2026 in Baguio City, Philippines.</w:t>
       </w:r>
     </w:p>
     <w:p>
       <w:pPr>
-        <w:jc w:val="center"/>
+        <w:spacing w:line="240" w:lineRule="auto"/>
+        <w:contextualSpacing/>
         <w:rPr>
           <w:rFonts w:ascii="Arial" w:hAnsi="Arial" w:cs="Arial"/>
+          <w:b/>
+          <w:bCs/>
           <w:lang w:val="en-US"/>
         </w:rPr>
       </w:pPr>
     </w:p>
     <w:p>
       <w:pPr>
-        <w:jc w:val="center"/>
+        <w:spacing w:line="240" w:lineRule="auto"/>
+        <w:contextualSpacing/>
         <w:rPr>
           <w:rFonts w:ascii="Arial" w:hAnsi="Arial" w:cs="Arial"/>
-          <w:lang w:val="en-US"/>
-        </w:rPr>
-      </w:pPr>
-      <w:r>
-        <w:rPr>
-          <w:rFonts w:ascii="Arial" w:hAnsi="Arial" w:cs="Arial"/>
-          <w:lang w:val="en-US"/>
-        </w:rPr>
-        <w:t>Issued this 9</w:t>
-      </w:r>
-      <w:r>
-        <w:rPr>
-          <w:rFonts w:ascii="Arial" w:hAnsi="Arial" w:cs="Arial"/>
-          <w:vertAlign w:val="superscript"/>
-          <w:lang w:val="en-US"/>
-        </w:rPr>
-        <w:t>th</w:t>
-      </w:r>
-      <w:r>
-        <w:rPr>
-          <w:rFonts w:ascii="Arial" w:hAnsi="Arial" w:cs="Arial"/>
-          <w:lang w:val="en-US"/>
-        </w:rPr>
-        <w:t xml:space="preserve"> of December 2025, Baguio </w:t>
-      </w:r>
-      <w:proofErr w:type="gramStart"/>
-      <w:r>
-        <w:rPr>
-          <w:rFonts w:ascii="Arial" w:hAnsi="Arial" w:cs="Arial"/>
-          <w:lang w:val="en-US"/>
-        </w:rPr>
-        <w:t>City.</w:t>
-      </w:r>
-      <w:r>
-        <w:rPr>
-          <w:rFonts w:ascii="Arial" w:hAnsi="Arial" w:cs="Arial"/>
-          <w:lang w:val="en-US"/>
-        </w:rPr>
-        <w:t>(</w:t>
-      </w:r>
-      <w:proofErr w:type="gramEnd"/>
-      <w:r>
-        <w:rPr>
-          <w:rFonts w:ascii="Arial" w:hAnsi="Arial" w:cs="Arial"/>
-          <w:lang w:val="en-US"/>
-        </w:rPr>
-        <w:t>)</w:t>
-      </w:r>
-    </w:p>
-    <w:p>
-      <w:pPr>
-        <w:jc w:val="center"/>
-        <w:rPr>
-          <w:rFonts w:ascii="Arial" w:hAnsi="Arial" w:cs="Arial"/>
+          <w:b/>
+          <w:bCs/>
           <w:lang w:val="en-US"/>
         </w:rPr>
       </w:pPr>
     </w:p>
     <w:p>
       <w:pPr>
+        <w:spacing w:line="240" w:lineRule="auto"/>
+        <w:contextualSpacing/>
         <w:rPr>
           <w:rFonts w:ascii="Arial" w:hAnsi="Arial" w:cs="Arial"/>
-          <w:lang w:val="en-US"/>
-        </w:rPr>
-      </w:pPr>
-    </w:p>
-    <w:p>
-      <w:pPr>
-        <w:jc w:val="center"/>
-        <w:rPr>
-          <w:rFonts w:ascii="Arial" w:hAnsi="Arial" w:cs="Arial"/>
+          <w:b/>
+          <w:bCs/>
           <w:lang w:val="en-US"/>
         </w:rPr>
       </w:pPr>
@@ -482,73 +243,14 @@
           <w:rFonts w:ascii="Arial" w:hAnsi="Arial" w:cs="Arial"/>
           <w:lang w:val="en-US"/>
         </w:rPr>
-        <w:t>City Mayor</w:t>
-      </w:r>
-    </w:p>
-    <w:p>
-      <w:pPr>
-        <w:spacing w:line="240" w:lineRule="auto"/>
-        <w:contextualSpacing/>
-        <w:jc w:val="center"/>
-        <w:rPr>
-          <w:rFonts w:ascii="Arial" w:hAnsi="Arial" w:cs="Arial"/>
-          <w:lang w:val="en-US"/>
-        </w:rPr>
-      </w:pPr>
-      <w:r>
-        <w:rPr>
-          <w:rFonts w:ascii="Arial" w:hAnsi="Arial" w:cs="Arial"/>
-          <w:lang w:val="en-US"/>
-        </w:rPr>
         <w:t>LCAT-VAWC Chairperson</w:t>
       </w:r>
-    </w:p>
-    <w:p>
-      <w:pPr>
-        <w:jc w:val="center"/>
-        <w:rPr>
-          <w:rFonts w:ascii="Arial" w:hAnsi="Arial" w:cs="Arial"/>
-          <w:lang w:val="en-US"/>
-        </w:rPr>
-      </w:pPr>
-      <w:r>
-        <w:rPr>
-          <w:rFonts w:ascii="Arial" w:hAnsi="Arial" w:cs="Arial"/>
-          <w:lang w:val="en-US"/>
-        </w:rPr>
-        <w:t>/</w:t>
-      </w:r>
-      <w:proofErr w:type="spellStart"/>
-      <w:r>
-        <w:rPr>
-          <w:rFonts w:ascii="Arial" w:hAnsi="Arial" w:cs="Arial"/>
-          <w:lang w:val="en-US"/>
-        </w:rPr>
-        <w:t>drmo</w:t>
-      </w:r>
-      <w:proofErr w:type="spellEnd"/>
-      <w:r>
-        <w:rPr>
-          <w:rFonts w:ascii="Arial" w:hAnsi="Arial" w:cs="Arial"/>
-          <w:lang w:val="en-US"/>
-        </w:rPr>
-        <w:t>/</w:t>
-      </w:r>
-      <w:proofErr w:type="spellStart"/>
-      <w:r>
-        <w:rPr>
-          <w:rFonts w:ascii="Arial" w:hAnsi="Arial" w:cs="Arial"/>
-          <w:lang w:val="en-US"/>
-        </w:rPr>
-        <w:t>ctb</w:t>
-      </w:r>
-      <w:proofErr w:type="spellEnd"/>
     </w:p>
     <w:sectPr>
       <w:headerReference w:type="default" r:id="rId6"/>
       <w:footerReference w:type="default" r:id="rId7"/>
-      <w:pgSz w:w="11906" w:h="16838" w:code="9"/>
-      <w:pgMar w:top="1440" w:right="1440" w:bottom="1440" w:left="1440" w:header="510" w:footer="708" w:gutter="0"/>
+      <w:pgSz w:w="11906" w:h="8391" w:orient="landscape" w:code="11"/>
+      <w:pgMar w:top="1440" w:right="1440" w:bottom="360" w:left="1440" w:header="510" w:footer="389" w:gutter="0"/>
       <w:cols w:space="708"/>
       <w:docGrid w:linePitch="360"/>
     </w:sectPr>
@@ -603,7 +305,7 @@
           <wp:extent cx="1289050" cy="634365"/>
           <wp:effectExtent l="0" t="0" r="0" b="0"/>
           <wp:wrapSquare wrapText="bothSides"/>
-          <wp:docPr id="350248279" name="Picture 3"/>
+          <wp:docPr id="562419439" name="Picture 3"/>
           <wp:cNvGraphicFramePr>
             <a:graphicFrameLocks xmlns:a="http://schemas.openxmlformats.org/drawingml/2006/main" noChangeAspect="1"/>
           </wp:cNvGraphicFramePr>
@@ -797,7 +499,7 @@
         <w:noProof/>
       </w:rPr>
       <w:drawing>
-        <wp:anchor distT="0" distB="0" distL="114300" distR="114300" simplePos="0" relativeHeight="251667456" behindDoc="1" locked="0" layoutInCell="1" allowOverlap="1" wp14:anchorId="6EE5935E" wp14:editId="277772F9">
+        <wp:anchor distT="0" distB="0" distL="114300" distR="114300" simplePos="0" relativeHeight="251667456" behindDoc="1" locked="0" layoutInCell="1" allowOverlap="1" wp14:anchorId="6EE5935E" wp14:editId="6E74E2A8">
           <wp:simplePos x="0" y="0"/>
           <wp:positionH relativeFrom="leftMargin">
             <wp:posOffset>436810</wp:posOffset>
@@ -808,7 +510,7 @@
           <wp:extent cx="733530" cy="733530"/>
           <wp:effectExtent l="0" t="0" r="9525" b="9525"/>
           <wp:wrapNone/>
-          <wp:docPr id="165893037" name="Picture 5"/>
+          <wp:docPr id="804856914" name="Picture 5"/>
           <wp:cNvGraphicFramePr>
             <a:graphicFrameLocks xmlns:a="http://schemas.openxmlformats.org/drawingml/2006/main" noChangeAspect="1"/>
           </wp:cNvGraphicFramePr>
@@ -866,7 +568,7 @@
       <mc:AlternateContent>
         <mc:Choice Requires="wps">
           <w:drawing>
-            <wp:anchor distT="0" distB="0" distL="114300" distR="114300" simplePos="0" relativeHeight="251666432" behindDoc="0" locked="0" layoutInCell="1" allowOverlap="1" wp14:anchorId="6548E9D0" wp14:editId="186B1CD1">
+            <wp:anchor distT="0" distB="0" distL="114300" distR="114300" simplePos="0" relativeHeight="251666432" behindDoc="0" locked="0" layoutInCell="1" allowOverlap="1" wp14:anchorId="6548E9D0" wp14:editId="576035CB">
               <wp:simplePos x="0" y="0"/>
               <wp:positionH relativeFrom="margin">
                 <wp:align>center</wp:align>
@@ -941,7 +643,7 @@
       <mc:AlternateContent>
         <mc:Choice Requires="wps">
           <w:drawing>
-            <wp:anchor distT="45720" distB="45720" distL="114300" distR="114300" simplePos="0" relativeHeight="251660288" behindDoc="0" locked="0" layoutInCell="1" allowOverlap="1" wp14:anchorId="1966FCD9" wp14:editId="26932891">
+            <wp:anchor distT="45720" distB="45720" distL="114300" distR="114300" simplePos="0" relativeHeight="251660288" behindDoc="0" locked="0" layoutInCell="1" allowOverlap="1" wp14:anchorId="1966FCD9" wp14:editId="7A7CE873">
               <wp:simplePos x="0" y="0"/>
               <wp:positionH relativeFrom="column">
                 <wp:posOffset>265430</wp:posOffset>
@@ -1771,7 +1473,6 @@
   <w:style w:type="character" w:default="1" w:styleId="DefaultParagraphFont">
     <w:name w:val="Default Paragraph Font"/>
     <w:uiPriority w:val="1"/>
-    <w:semiHidden/>
     <w:unhideWhenUsed/>
   </w:style>
   <w:style w:type="table" w:default="1" w:styleId="TableNormal">

</xml_diff>